<commit_message>
docs: correct defense group information
</commit_message>
<xml_diff>
--- a/output/docx/xv6全实验课程设计报告.docx
+++ b/output/docx/xv6全实验课程设计报告.docx
@@ -202,7 +202,7 @@
                 <w:rFonts w:ascii="Microsoft YaHei" w:hAnsi="Microsoft YaHei" w:eastAsia="Microsoft YaHei"/>
                 <w:sz w:val="21"/>
               </w:rPr>
-              <w:t>1 组</w:t>
+              <w:t>79 组</w:t>
             </w:r>
           </w:p>
         </w:tc>
@@ -1545,7 +1545,7 @@
                 <w:rFonts w:ascii="Microsoft YaHei" w:hAnsi="Microsoft YaHei" w:eastAsia="Microsoft YaHei"/>
                 <w:sz w:val="22"/>
               </w:rPr>
-              <w:t>1 组</w:t>
+              <w:t>79 组</w:t>
             </w:r>
           </w:p>
         </w:tc>
@@ -1701,7 +1701,7 @@
                 <w:rFonts w:ascii="Microsoft YaHei" w:hAnsi="Microsoft YaHei" w:eastAsia="Microsoft YaHei"/>
                 <w:sz w:val="22"/>
               </w:rPr>
-              <w:t>4</w:t>
+              <w:t>42028704</w:t>
             </w:r>
           </w:p>
         </w:tc>

</xml_diff>